<commit_message>
docs: add github repository to proposal
</commit_message>
<xml_diff>
--- a/docs/competition/MoonSeal项目申报书.docx
+++ b/docs/competition/MoonSeal项目申报书.docx
@@ -8,7 +8,7 @@
       </w:pPr>
       <w:r>
         <w:rPr>
-          <w:rFonts w:ascii="Microsoft YaHei" w:hAnsi="Microsoft YaHei"/>
+          <w:rFonts w:ascii="Microsoft YaHei" w:hAnsi="Microsoft YaHei" w:eastAsia="Microsoft YaHei"/>
           <w:b/>
           <w:color w:val="1F4D79"/>
           <w:sz w:val="40"/>
@@ -22,6 +22,7 @@
       </w:pPr>
       <w:r>
         <w:rPr>
+          <w:rFonts w:ascii="Microsoft YaHei" w:hAnsi="Microsoft YaHei" w:eastAsia="Microsoft YaHei"/>
           <w:sz w:val="22"/>
         </w:rPr>
         <w:t>MoonBit 测试充分性与发布质量门禁工具</w:t>
@@ -34,26 +35,36 @@
         <w:tblLook w:firstColumn="1" w:firstRow="1" w:lastColumn="0" w:lastRow="0" w:noHBand="0" w:noVBand="1" w:val="04A0"/>
       </w:tblPr>
       <w:tblGrid>
-        <w:gridCol w:w="4680"/>
-        <w:gridCol w:w="4680"/>
+        <w:gridCol w:w="4824"/>
+        <w:gridCol w:w="4824"/>
       </w:tblGrid>
       <w:tr>
         <w:tc>
           <w:tcPr>
-            <w:tcW w:type="dxa" w:w="4680"/>
+            <w:tcW w:type="dxa" w:w="4824"/>
+            <w:shd w:fill="EAF1F7"/>
           </w:tcPr>
           <w:p>
+            <w:r/>
             <w:r>
+              <w:rPr>
+                <w:rFonts w:ascii="Microsoft YaHei" w:hAnsi="Microsoft YaHei" w:eastAsia="Microsoft YaHei"/>
+                <w:b/>
+              </w:rPr>
               <w:t>项目名称</w:t>
             </w:r>
           </w:p>
         </w:tc>
         <w:tc>
           <w:tcPr>
-            <w:tcW w:type="dxa" w:w="4680"/>
+            <w:tcW w:type="dxa" w:w="4824"/>
           </w:tcPr>
           <w:p>
+            <w:r/>
             <w:r>
+              <w:rPr>
+                <w:rFonts w:ascii="Microsoft YaHei" w:hAnsi="Microsoft YaHei" w:eastAsia="Microsoft YaHei"/>
+              </w:rPr>
               <w:t>MoonSeal</w:t>
             </w:r>
           </w:p>
@@ -62,20 +73,30 @@
       <w:tr>
         <w:tc>
           <w:tcPr>
-            <w:tcW w:type="dxa" w:w="4680"/>
+            <w:tcW w:type="dxa" w:w="4824"/>
+            <w:shd w:fill="EAF1F7"/>
           </w:tcPr>
           <w:p>
+            <w:r/>
             <w:r>
+              <w:rPr>
+                <w:rFonts w:ascii="Microsoft YaHei" w:hAnsi="Microsoft YaHei" w:eastAsia="Microsoft YaHei"/>
+                <w:b/>
+              </w:rPr>
               <w:t>项目方向</w:t>
             </w:r>
           </w:p>
         </w:tc>
         <w:tc>
           <w:tcPr>
-            <w:tcW w:type="dxa" w:w="4680"/>
+            <w:tcW w:type="dxa" w:w="4824"/>
           </w:tcPr>
           <w:p>
+            <w:r/>
             <w:r>
+              <w:rPr>
+                <w:rFonts w:ascii="Microsoft YaHei" w:hAnsi="Microsoft YaHei" w:eastAsia="Microsoft YaHei"/>
+              </w:rPr>
               <w:t>软件分析框架 / 工程质量工具</w:t>
             </w:r>
           </w:p>
@@ -84,21 +105,31 @@
       <w:tr>
         <w:tc>
           <w:tcPr>
-            <w:tcW w:type="dxa" w:w="4680"/>
+            <w:tcW w:type="dxa" w:w="4824"/>
+            <w:shd w:fill="EAF1F7"/>
           </w:tcPr>
           <w:p>
+            <w:r/>
             <w:r>
-              <w:t>开源协议</w:t>
+              <w:rPr>
+                <w:rFonts w:ascii="Microsoft YaHei" w:hAnsi="Microsoft YaHei" w:eastAsia="Microsoft YaHei"/>
+                <w:b/>
+              </w:rPr>
+              <w:t>GitLink 仓库</w:t>
             </w:r>
           </w:p>
         </w:tc>
         <w:tc>
           <w:tcPr>
-            <w:tcW w:type="dxa" w:w="4680"/>
+            <w:tcW w:type="dxa" w:w="4824"/>
           </w:tcPr>
           <w:p>
+            <w:r/>
             <w:r>
-              <w:t>Apache-2.0</w:t>
+              <w:rPr>
+                <w:rFonts w:ascii="Microsoft YaHei" w:hAnsi="Microsoft YaHei" w:eastAsia="Microsoft YaHei"/>
+              </w:rPr>
+              <w:t>https://gitlink.org.cn/LL1266/moonseal</w:t>
             </w:r>
           </w:p>
         </w:tc>
@@ -106,26 +137,69 @@
       <w:tr>
         <w:tc>
           <w:tcPr>
-            <w:tcW w:type="dxa" w:w="4680"/>
+            <w:tcW w:type="dxa" w:w="4824"/>
+            <w:shd w:fill="EAF1F7"/>
           </w:tcPr>
           <w:p>
+            <w:r/>
             <w:r>
-              <w:t>仓库地址</w:t>
+              <w:rPr>
+                <w:rFonts w:ascii="Microsoft YaHei" w:hAnsi="Microsoft YaHei" w:eastAsia="Microsoft YaHei"/>
+                <w:b/>
+              </w:rPr>
+              <w:t>GitHub 仓库</w:t>
             </w:r>
           </w:p>
         </w:tc>
         <w:tc>
           <w:tcPr>
-            <w:tcW w:type="dxa" w:w="4680"/>
+            <w:tcW w:type="dxa" w:w="4824"/>
           </w:tcPr>
           <w:p>
+            <w:r/>
             <w:r>
-              <w:t>https://gitlink.org.cn/LL1266/moonseal</w:t>
+              <w:rPr>
+                <w:rFonts w:ascii="Microsoft YaHei" w:hAnsi="Microsoft YaHei" w:eastAsia="Microsoft YaHei"/>
+              </w:rPr>
+              <w:t>https://github.com/LL728/L28L</w:t>
+            </w:r>
+          </w:p>
+        </w:tc>
+      </w:tr>
+      <w:tr>
+        <w:tc>
+          <w:tcPr>
+            <w:tcW w:type="dxa" w:w="4824"/>
+            <w:shd w:fill="EAF1F7"/>
+          </w:tcPr>
+          <w:p>
+            <w:r/>
+            <w:r>
+              <w:rPr>
+                <w:rFonts w:ascii="Microsoft YaHei" w:hAnsi="Microsoft YaHei" w:eastAsia="Microsoft YaHei"/>
+                <w:b/>
+              </w:rPr>
+              <w:t>开源协议</w:t>
+            </w:r>
+          </w:p>
+        </w:tc>
+        <w:tc>
+          <w:tcPr>
+            <w:tcW w:type="dxa" w:w="4824"/>
+          </w:tcPr>
+          <w:p>
+            <w:r/>
+            <w:r>
+              <w:rPr>
+                <w:rFonts w:ascii="Microsoft YaHei" w:hAnsi="Microsoft YaHei" w:eastAsia="Microsoft YaHei"/>
+              </w:rPr>
+              <w:t>Apache-2.0</w:t>
             </w:r>
           </w:p>
         </w:tc>
       </w:tr>
     </w:tbl>
+    <w:p/>
     <w:p>
       <w:pPr>
         <w:pStyle w:val="Heading1"/>
@@ -144,12 +218,36 @@
         <w:pStyle w:val="Heading1"/>
       </w:pPr>
       <w:r>
-        <w:t>2. 项目简介</w:t>
+        <w:t>2. 仓库地址</w:t>
+      </w:r>
+    </w:p>
+    <w:p>
+      <w:pPr>
+        <w:pStyle w:val="ListBullet"/>
+      </w:pPr>
+      <w:r>
+        <w:t>GitLink 仓库：https://gitlink.org.cn/LL1266/moonseal</w:t>
+      </w:r>
+    </w:p>
+    <w:p>
+      <w:pPr>
+        <w:pStyle w:val="ListBullet"/>
+      </w:pPr>
+      <w:r>
+        <w:t>GitHub 仓库：https://github.com/LL728/L28L</w:t>
+      </w:r>
+    </w:p>
+    <w:p>
+      <w:pPr>
+        <w:pStyle w:val="Heading1"/>
+      </w:pPr>
+      <w:r>
+        <w:t>3. 项目简介</w:t>
       </w:r>
     </w:p>
     <w:p>
       <w:r>
-        <w:t>MoonSeal 面向 MoonBit 开源项目的发布前质量检查，提供测试文件发现、包级测试充分性分析、公共接口测试提示、变异测试候选生成和默认发布门禁。项目目标是让 MoonBit 项目在提交、参赛、发布和维护前有一套可重复执行的质量检查。</w:t>
+        <w:t>MoonSeal 面向 MoonBit 开源项目的发布前质量检查，提供测试文件发现、包级测试充分性分析、公共接口测试提示、变异测试候选生成和默认发布门禁。项目目标是让 MoonBit 项目在提交、参赛、发布和维护前有一套可重复执行的质量检查流程。</w:t>
       </w:r>
     </w:p>
     <w:p>
@@ -162,12 +260,12 @@
         <w:pStyle w:val="Heading1"/>
       </w:pPr>
       <w:r>
-        <w:t>3. 项目方向与适用场景</w:t>
+        <w:t>4. 项目方向与适用场景</w:t>
       </w:r>
     </w:p>
     <w:p>
       <w:r>
-        <w:t>项目属于软件分析框架和工程质量工具方向，适用于：</w:t>
+        <w:t>项目属于软件分析框架和工程质量工具方向，适用于以下场景：</w:t>
       </w:r>
     </w:p>
     <w:p>
@@ -207,7 +305,7 @@
         <w:pStyle w:val="Heading1"/>
       </w:pPr>
       <w:r>
-        <w:t>4. 核心功能</w:t>
+        <w:t>5. 核心功能</w:t>
       </w:r>
     </w:p>
     <w:p>
@@ -239,7 +337,7 @@
         <w:pStyle w:val="ListBullet"/>
       </w:pPr>
       <w:r>
-        <w:t>生成布尔、比较符、整数边界和逻辑运算的变异候选。</w:t>
+        <w:t>生成布尔、比较符、整数边界和逻辑运算的变异测试候选。</w:t>
       </w:r>
     </w:p>
     <w:p>
@@ -263,12 +361,12 @@
         <w:pStyle w:val="Heading1"/>
       </w:pPr>
       <w:r>
-        <w:t>5. 原创性与差异说明</w:t>
+        <w:t>6. 原创性与差异说明</w:t>
       </w:r>
     </w:p>
     <w:p>
       <w:r>
-        <w:t>Mooncakes 公开模块列表中未发现面向 MoonBit 的测试充分性门禁或变异测试候选工具。已有工具更多集中在语法检查、依赖诊断或通用库能力，MoonSeal 选择测试质量这个更成熟的软件工程方向，能够和 MoonBit 的包结构、测试文件命名和接口文件直接结合。</w:t>
+        <w:t>Mooncakes 公开模块列表中未发现面向 MoonBit 的测试充分性门禁或变异测试候选工具。已有工具更多集中在语法检查、依赖诊断或通用库能力，MoonSeal 选择测试质量这个更成熟的软件工程方向，并和 MoonBit 的包结构、测试文件命名和接口文件直接结合。</w:t>
       </w:r>
     </w:p>
     <w:p>
@@ -281,7 +379,7 @@
         <w:pStyle w:val="Heading1"/>
       </w:pPr>
       <w:r>
-        <w:t>6. 技术路线</w:t>
+        <w:t>7. 技术路线</w:t>
       </w:r>
     </w:p>
     <w:p>
@@ -342,7 +440,7 @@
         <w:pStyle w:val="Heading1"/>
       </w:pPr>
       <w:r>
-        <w:t>7. 测试与验收</w:t>
+        <w:t>8. 测试与验收</w:t>
       </w:r>
     </w:p>
     <w:p>
@@ -406,7 +504,7 @@
     <w:p>
       <w:r>
         <w:rPr>
-          <w:rFonts w:ascii="Consolas" w:hAnsi="Consolas"/>
+          <w:rFonts w:ascii="Consolas" w:hAnsi="Consolas" w:eastAsia="Consolas"/>
           <w:sz w:val="18"/>
         </w:rPr>
         <w:t>moon info</w:t>
@@ -429,7 +527,7 @@
         <w:pStyle w:val="Heading1"/>
       </w:pPr>
       <w:r>
-        <w:t>8. 后续演进路线</w:t>
+        <w:t>9. 后续演进路线</w:t>
       </w:r>
     </w:p>
     <w:p>
@@ -477,7 +575,7 @@
         <w:pStyle w:val="Heading1"/>
       </w:pPr>
       <w:r>
-        <w:t>9. 开源协议</w:t>
+        <w:t>10. 开源协议</w:t>
       </w:r>
     </w:p>
     <w:p>
@@ -487,7 +585,7 @@
     </w:p>
     <w:sectPr>
       <w:pgSz w:w="12240" w:h="15840"/>
-      <w:pgMar w:top="1440" w:right="1440" w:bottom="1440" w:left="1440" w:header="720" w:footer="720" w:gutter="0"/>
+      <w:pgMar w:top="1224" w:right="1296" w:bottom="1224" w:left="1296" w:header="720" w:footer="720" w:gutter="0"/>
       <w:cols w:space="720"/>
       <w:docGrid w:linePitch="360"/>
     </w:sectPr>
@@ -859,11 +957,11 @@
     <w:qFormat/>
     <w:rsid w:val="00FC693F"/>
     <w:pPr>
-      <w:spacing w:after="160" w:line="300" w:lineRule="auto"/>
+      <w:spacing w:after="120" w:line="283" w:lineRule="auto"/>
     </w:pPr>
     <w:rPr>
-      <w:rFonts w:ascii="Microsoft YaHei" w:hAnsi="Microsoft YaHei"/>
-      <w:sz w:val="22"/>
+      <w:rFonts w:ascii="Microsoft YaHei" w:hAnsi="Microsoft YaHei" w:eastAsia="Microsoft YaHei"/>
+      <w:sz w:val="21"/>
     </w:rPr>
   </w:style>
   <w:style w:type="paragraph" w:styleId="Header">
@@ -921,15 +1019,15 @@
     <w:pPr>
       <w:keepNext/>
       <w:keepLines/>
-      <w:spacing w:before="320" w:after="160"/>
+      <w:spacing w:before="240" w:after="120"/>
       <w:outlineLvl w:val="0"/>
     </w:pPr>
     <w:rPr>
-      <w:rFonts w:asciiTheme="majorHAnsi" w:eastAsiaTheme="majorEastAsia" w:hAnsiTheme="majorHAnsi" w:cstheme="majorBidi" w:ascii="Microsoft YaHei" w:hAnsi="Microsoft YaHei"/>
+      <w:rFonts w:asciiTheme="majorHAnsi" w:eastAsiaTheme="majorEastAsia" w:hAnsiTheme="majorHAnsi" w:cstheme="majorBidi" w:ascii="Microsoft YaHei" w:hAnsi="Microsoft YaHei" w:eastAsia="Microsoft YaHei"/>
       <w:b/>
       <w:bCs/>
-      <w:color w:val="2E74B5"/>
-      <w:sz w:val="32"/>
+      <w:color w:val="1F4D79"/>
+      <w:sz w:val="28"/>
       <w:szCs w:val="28"/>
     </w:rPr>
   </w:style>

</xml_diff>